<commit_message>
post-review revision (not fully captured in repo)
</commit_message>
<xml_diff>
--- a/minimal_packing_manuscript/minimal_packing.docx
+++ b/minimal_packing_manuscript/minimal_packing.docx
@@ -116,7 +116,7 @@
         <w:pStyle w:val="FirstParagraph"/>
       </w:pPr>
       <w:r>
-        <w:t xml:space="preserve">Discrete soil description, analytical solutions, open-source algorithms, computational cost</w:t>
+        <w:t xml:space="preserve">Discrete soil description, discrete element method, open-source algorithms, computational cost</w:t>
       </w:r>
     </w:p>
     <w:bookmarkEnd w:id="21"/>
@@ -203,8 +203,8 @@
         <m:d>
           <m:dPr>
             <m:begChr m:val="("/>
+            <m:sepChr m:val=""/>
             <m:endChr m:val=")"/>
-            <m:sepChr m:val=""/>
             <m:grow/>
           </m:dPr>
           <m:e>
@@ -243,8 +243,8 @@
         <m:d>
           <m:dPr>
             <m:begChr m:val="("/>
+            <m:sepChr m:val=""/>
             <m:endChr m:val=")"/>
-            <m:sepChr m:val=""/>
             <m:grow/>
           </m:dPr>
           <m:e>
@@ -280,8 +280,8 @@
         <m:d>
           <m:dPr>
             <m:begChr m:val="("/>
+            <m:sepChr m:val=""/>
             <m:endChr m:val=")"/>
-            <m:sepChr m:val=""/>
             <m:grow/>
           </m:dPr>
           <m:e>
@@ -350,8 +350,8 @@
         <m:d>
           <m:dPr>
             <m:begChr m:val="("/>
+            <m:sepChr m:val=""/>
             <m:endChr m:val=")"/>
-            <m:sepChr m:val=""/>
             <m:grow/>
           </m:dPr>
           <m:e>
@@ -386,7 +386,7 @@
         <w:t xml:space="preserve"> </w:t>
       </w:r>
       <w:r>
-        <w:t xml:space="preserve">Dong, Yan, and Cui (2022)</w:t>
+        <w:t xml:space="preserve">Dong, Yan and Cui (2022)</w:t>
       </w:r>
       <w:r>
         <w:t xml:space="preserve">) to</w:t>
@@ -405,8 +405,8 @@
         <m:d>
           <m:dPr>
             <m:begChr m:val="("/>
+            <m:sepChr m:val=""/>
             <m:endChr m:val=")"/>
-            <m:sepChr m:val=""/>
             <m:grow/>
           </m:dPr>
           <m:e>
@@ -473,7 +473,7 @@
         <w:t xml:space="preserve"> </w:t>
       </w:r>
       <w:r>
-        <w:t xml:space="preserve">(Gitman, Askes, and Sluys 2007)</w:t>
+        <w:t xml:space="preserve">(Gitman, Askes and Sluys, 2007)</w:t>
       </w:r>
       <w:r>
         <w:t xml:space="preserve">.</w:t>
@@ -502,7 +502,7 @@
         <w:t xml:space="preserve"> </w:t>
       </w:r>
       <w:r>
-        <w:t xml:space="preserve">(Cantor and Ovalle 2025)</w:t>
+        <w:t xml:space="preserve">(Cantor and Ovalle, 2025)</w:t>
       </w:r>
       <w:r>
         <w:t xml:space="preserve">.</w:t>
@@ -517,7 +517,7 @@
         <w:t xml:space="preserve"> </w:t>
       </w:r>
       <w:r>
-        <w:t xml:space="preserve">(Zeraati-Shamsabadi and Sadrekarimi 2025)</w:t>
+        <w:t xml:space="preserve">(Zeraati-Shamsabadi and Sadrekarimi, 2025)</w:t>
       </w:r>
       <w:r>
         <w:t xml:space="preserve"> </w:t>
@@ -529,7 +529,7 @@
         <w:t xml:space="preserve"> </w:t>
       </w:r>
       <w:r>
-        <w:t xml:space="preserve">(Bandera et al. 2021)</w:t>
+        <w:t xml:space="preserve">(Bandera et al., 2021)</w:t>
       </w:r>
       <w:r>
         <w:t xml:space="preserve"> </w:t>
@@ -892,8 +892,8 @@
           <m:d>
             <m:dPr>
               <m:begChr m:val="("/>
+              <m:sepChr m:val=""/>
               <m:endChr m:val=")"/>
-              <m:sepChr m:val=""/>
               <m:grow/>
             </m:dPr>
             <m:e>
@@ -959,8 +959,8 @@
           <m:d>
             <m:dPr>
               <m:begChr m:val="("/>
+              <m:sepChr m:val=""/>
               <m:endChr m:val=")"/>
-              <m:sepChr m:val=""/>
               <m:grow/>
             </m:dPr>
             <m:e>
@@ -1142,8 +1142,8 @@
           <m:d>
             <m:dPr>
               <m:begChr m:val="("/>
+              <m:sepChr m:val=""/>
               <m:endChr m:val=")"/>
-              <m:sepChr m:val=""/>
               <m:grow/>
             </m:dPr>
             <m:e>
@@ -1241,8 +1241,8 @@
           <m:d>
             <m:dPr>
               <m:begChr m:val="("/>
+              <m:sepChr m:val=""/>
               <m:endChr m:val=")"/>
-              <m:sepChr m:val=""/>
               <m:grow/>
             </m:dPr>
             <m:e>
@@ -1352,8 +1352,8 @@
           <m:d>
             <m:dPr>
               <m:begChr m:val="("/>
+              <m:sepChr m:val=""/>
               <m:endChr m:val=")"/>
-              <m:sepChr m:val=""/>
               <m:grow/>
             </m:dPr>
             <m:e>
@@ -1633,8 +1633,8 @@
           <m:d>
             <m:dPr>
               <m:begChr m:val="("/>
+              <m:sepChr m:val=""/>
               <m:endChr m:val=")"/>
-              <m:sepChr m:val=""/>
               <m:grow/>
             </m:dPr>
             <m:e>
@@ -1700,8 +1700,8 @@
           <m:d>
             <m:dPr>
               <m:begChr m:val="("/>
+              <m:sepChr m:val=""/>
               <m:endChr m:val=")"/>
-              <m:sepChr m:val=""/>
               <m:grow/>
             </m:dPr>
             <m:e>
@@ -1883,8 +1883,8 @@
           <m:d>
             <m:dPr>
               <m:begChr m:val="("/>
+              <m:sepChr m:val=""/>
               <m:endChr m:val=")"/>
-              <m:sepChr m:val=""/>
               <m:grow/>
             </m:dPr>
             <m:e>
@@ -1982,8 +1982,8 @@
           <m:d>
             <m:dPr>
               <m:begChr m:val="("/>
+              <m:sepChr m:val=""/>
               <m:endChr m:val=")"/>
-              <m:sepChr m:val=""/>
               <m:grow/>
             </m:dPr>
             <m:e>
@@ -2129,8 +2129,8 @@
           <m:d>
             <m:dPr>
               <m:begChr m:val="("/>
+              <m:sepChr m:val=""/>
               <m:endChr m:val=")"/>
-              <m:sepChr m:val=""/>
               <m:grow/>
             </m:dPr>
             <m:e>
@@ -2415,8 +2415,8 @@
           <m:d>
             <m:dPr>
               <m:begChr m:val="("/>
+              <m:sepChr m:val=""/>
               <m:endChr m:val=")"/>
-              <m:sepChr m:val=""/>
               <m:grow/>
             </m:dPr>
             <m:e>
@@ -2483,7 +2483,7 @@
         <w:t xml:space="preserve"> </w:t>
       </w:r>
       <w:r>
-        <w:t xml:space="preserve">(D18 Committee, n.d.)</w:t>
+        <w:t xml:space="preserve">(D18 Committee, 2017)</w:t>
       </w:r>
       <w:r>
         <w:t xml:space="preserve">.</w:t>
@@ -2642,8 +2642,8 @@
           <m:d>
             <m:dPr>
               <m:begChr m:val="("/>
+              <m:sepChr m:val=""/>
               <m:endChr m:val=")"/>
-              <m:sepChr m:val=""/>
               <m:grow/>
             </m:dPr>
             <m:e>
@@ -2676,8 +2676,8 @@
           <m:d>
             <m:dPr>
               <m:begChr m:val="("/>
+              <m:sepChr m:val=""/>
               <m:endChr m:val=")"/>
-              <m:sepChr m:val=""/>
               <m:grow/>
             </m:dPr>
             <m:e>
@@ -2710,8 +2710,8 @@
           <m:d>
             <m:dPr>
               <m:begChr m:val="("/>
+              <m:sepChr m:val=""/>
               <m:endChr m:val=")"/>
-              <m:sepChr m:val=""/>
               <m:grow/>
             </m:dPr>
             <m:e>
@@ -2744,8 +2744,8 @@
           <m:d>
             <m:dPr>
               <m:begChr m:val="("/>
+              <m:sepChr m:val=""/>
               <m:endChr m:val=")"/>
-              <m:sepChr m:val=""/>
               <m:grow/>
             </m:dPr>
             <m:e>
@@ -2769,8 +2769,8 @@
           <m:d>
             <m:dPr>
               <m:begChr m:val="("/>
+              <m:sepChr m:val=""/>
               <m:endChr m:val=")"/>
-              <m:sepChr m:val=""/>
               <m:grow/>
             </m:dPr>
             <m:e>
@@ -2950,8 +2950,8 @@
           <m:d>
             <m:dPr>
               <m:begChr m:val="("/>
+              <m:sepChr m:val=""/>
               <m:endChr m:val=")"/>
-              <m:sepChr m:val=""/>
               <m:grow/>
             </m:dPr>
             <m:e>
@@ -3126,8 +3126,8 @@
           <m:d>
             <m:dPr>
               <m:begChr m:val="("/>
+              <m:sepChr m:val=""/>
               <m:endChr m:val=")"/>
-              <m:sepChr m:val=""/>
               <m:grow/>
             </m:dPr>
             <m:e>
@@ -3427,8 +3427,8 @@
           <m:d>
             <m:dPr>
               <m:begChr m:val="("/>
+              <m:sepChr m:val=""/>
               <m:endChr m:val=")"/>
-              <m:sepChr m:val=""/>
               <m:grow/>
             </m:dPr>
             <m:e>
@@ -3470,8 +3470,8 @@
           <m:d>
             <m:dPr>
               <m:begChr m:val="("/>
+              <m:sepChr m:val=""/>
               <m:endChr m:val=")"/>
-              <m:sepChr m:val=""/>
               <m:grow/>
             </m:dPr>
             <m:e>
@@ -3501,8 +3501,8 @@
         <m:d>
           <m:dPr>
             <m:begChr m:val="("/>
+            <m:sepChr m:val=""/>
             <m:endChr m:val=")"/>
-            <m:sepChr m:val=""/>
             <m:grow/>
           </m:dPr>
           <m:e>
@@ -3677,8 +3677,8 @@
           <m:d>
             <m:dPr>
               <m:begChr m:val="("/>
+              <m:sepChr m:val=""/>
               <m:endChr m:val=")"/>
-              <m:sepChr m:val=""/>
               <m:grow/>
             </m:dPr>
             <m:e>
@@ -3864,8 +3864,8 @@
           <m:d>
             <m:dPr>
               <m:begChr m:val="("/>
+              <m:sepChr m:val=""/>
               <m:endChr m:val=")"/>
-              <m:sepChr m:val=""/>
               <m:grow/>
             </m:dPr>
             <m:e>
@@ -3889,8 +3889,8 @@
           <m:d>
             <m:dPr>
               <m:begChr m:val="("/>
+              <m:sepChr m:val=""/>
               <m:endChr m:val=")"/>
-              <m:sepChr m:val=""/>
               <m:grow/>
             </m:dPr>
             <m:e>
@@ -4145,8 +4145,8 @@
         <m:d>
           <m:dPr>
             <m:begChr m:val="("/>
+            <m:sepChr m:val=""/>
             <m:endChr m:val=")"/>
-            <m:sepChr m:val=""/>
             <m:grow/>
           </m:dPr>
           <m:e>
@@ -4201,8 +4201,8 @@
           <m:d>
             <m:dPr>
               <m:begChr m:val="("/>
+              <m:sepChr m:val=""/>
               <m:endChr m:val=")"/>
-              <m:sepChr m:val=""/>
               <m:grow/>
             </m:dPr>
             <m:e>
@@ -4253,8 +4253,8 @@
           <m:d>
             <m:dPr>
               <m:begChr m:val="("/>
+              <m:sepChr m:val=""/>
               <m:endChr m:val=")"/>
-              <m:sepChr m:val=""/>
               <m:grow/>
             </m:dPr>
             <m:e>
@@ -4290,8 +4290,8 @@
         <m:d>
           <m:dPr>
             <m:begChr m:val="("/>
+            <m:sepChr m:val=""/>
             <m:endChr m:val=")"/>
-            <m:sepChr m:val=""/>
             <m:grow/>
           </m:dPr>
           <m:e>
@@ -5413,8 +5413,8 @@
           <m:d>
             <m:dPr>
               <m:begChr m:val="{"/>
+              <m:sepChr m:val=""/>
               <m:endChr m:val="}"/>
-              <m:sepChr m:val=""/>
               <m:grow/>
             </m:dPr>
             <m:e>
@@ -5532,8 +5532,8 @@
           <m:d>
             <m:dPr>
               <m:begChr m:val="("/>
+              <m:sepChr m:val=""/>
               <m:endChr m:val=")"/>
-              <m:sepChr m:val=""/>
               <m:grow/>
             </m:dPr>
             <m:e>
@@ -5670,8 +5670,8 @@
           <m:d>
             <m:dPr>
               <m:begChr m:val="{"/>
+              <m:sepChr m:val=""/>
               <m:endChr m:val="}"/>
-              <m:sepChr m:val=""/>
               <m:grow/>
             </m:dPr>
             <m:e>
@@ -5686,8 +5686,8 @@
                   <m:d>
                     <m:dPr>
                       <m:begChr m:val="("/>
+                      <m:sepChr m:val=""/>
                       <m:endChr m:val=")"/>
-                      <m:sepChr m:val=""/>
                       <m:grow/>
                     </m:dPr>
                     <m:e>
@@ -5716,8 +5716,8 @@
                   <m:d>
                     <m:dPr>
                       <m:begChr m:val="("/>
+                      <m:sepChr m:val=""/>
                       <m:endChr m:val=")"/>
-                      <m:sepChr m:val=""/>
                       <m:grow/>
                     </m:dPr>
                     <m:e>
@@ -5791,8 +5791,8 @@
           <m:d>
             <m:dPr>
               <m:begChr m:val="("/>
+              <m:sepChr m:val=""/>
               <m:endChr m:val=")"/>
-              <m:sepChr m:val=""/>
               <m:grow/>
             </m:dPr>
             <m:e>
@@ -5850,8 +5850,8 @@
         <m:d>
           <m:dPr>
             <m:begChr m:val="("/>
+            <m:sepChr m:val=""/>
             <m:endChr m:val=")"/>
-            <m:sepChr m:val=""/>
             <m:grow/>
           </m:dPr>
           <m:e>
@@ -6016,8 +6016,8 @@
           <m:d>
             <m:dPr>
               <m:begChr m:val="{"/>
+              <m:sepChr m:val=""/>
               <m:endChr m:val="}"/>
-              <m:sepChr m:val=""/>
               <m:grow/>
             </m:dPr>
             <m:e>
@@ -6105,8 +6105,8 @@
           <m:d>
             <m:dPr>
               <m:begChr m:val="("/>
+              <m:sepChr m:val=""/>
               <m:endChr m:val=")"/>
-              <m:sepChr m:val=""/>
               <m:grow/>
             </m:dPr>
             <m:e>
@@ -6424,8 +6424,8 @@
           <m:d>
             <m:dPr>
               <m:begChr m:val="("/>
+              <m:sepChr m:val=""/>
               <m:endChr m:val=")"/>
-              <m:sepChr m:val=""/>
               <m:grow/>
             </m:dPr>
             <m:e>
@@ -6448,8 +6448,8 @@
               <m:d>
                 <m:dPr>
                   <m:begChr m:val="("/>
+                  <m:sepChr m:val=""/>
                   <m:endChr m:val=")"/>
-                  <m:sepChr m:val=""/>
                   <m:grow/>
                 </m:dPr>
                 <m:e>
@@ -6514,8 +6514,8 @@
           <m:d>
             <m:dPr>
               <m:begChr m:val="("/>
+              <m:sepChr m:val=""/>
               <m:endChr m:val=")"/>
-              <m:sepChr m:val=""/>
               <m:grow/>
             </m:dPr>
             <m:e>
@@ -6705,16 +6705,16 @@
         <m:d>
           <m:dPr>
             <m:begChr m:val="("/>
+            <m:sepChr m:val=""/>
             <m:endChr m:val=")"/>
-            <m:sepChr m:val=""/>
             <m:grow/>
           </m:dPr>
           <m:e>
             <m:d>
               <m:dPr>
                 <m:begChr m:val="("/>
+                <m:sepChr m:val=""/>
                 <m:endChr m:val=")"/>
-                <m:sepChr m:val=""/>
                 <m:grow/>
               </m:dPr>
               <m:e>
@@ -6767,8 +6767,8 @@
             <m:d>
               <m:dPr>
                 <m:begChr m:val="("/>
+                <m:sepChr m:val=""/>
                 <m:endChr m:val=")"/>
-                <m:sepChr m:val=""/>
                 <m:grow/>
               </m:dPr>
               <m:e>
@@ -6800,8 +6800,8 @@
             <m:d>
               <m:dPr>
                 <m:begChr m:val="("/>
+                <m:sepChr m:val=""/>
                 <m:endChr m:val=")"/>
-                <m:sepChr m:val=""/>
                 <m:grow/>
               </m:dPr>
               <m:e>
@@ -6855,8 +6855,8 @@
             <m:d>
               <m:dPr>
                 <m:begChr m:val="("/>
+                <m:sepChr m:val=""/>
                 <m:endChr m:val=")"/>
-                <m:sepChr m:val=""/>
                 <m:grow/>
               </m:dPr>
               <m:e>
@@ -6903,8 +6903,8 @@
             <m:d>
               <m:dPr>
                 <m:begChr m:val="("/>
+                <m:sepChr m:val=""/>
                 <m:endChr m:val=")"/>
-                <m:sepChr m:val=""/>
                 <m:grow/>
               </m:dPr>
               <m:e>
@@ -6947,8 +6947,8 @@
             <m:d>
               <m:dPr>
                 <m:begChr m:val="("/>
+                <m:sepChr m:val=""/>
                 <m:endChr m:val=")"/>
-                <m:sepChr m:val=""/>
                 <m:grow/>
               </m:dPr>
               <m:e>
@@ -7006,8 +7006,8 @@
             <m:d>
               <m:dPr>
                 <m:begChr m:val="("/>
+                <m:sepChr m:val=""/>
                 <m:endChr m:val=")"/>
-                <m:sepChr m:val=""/>
                 <m:grow/>
               </m:dPr>
               <m:e>
@@ -7129,8 +7129,8 @@
         <m:d>
           <m:dPr>
             <m:begChr m:val="|"/>
+            <m:sepChr m:val=""/>
             <m:endChr m:val="|"/>
-            <m:sepChr m:val=""/>
             <m:grow/>
           </m:dPr>
           <m:e>
@@ -7147,8 +7147,8 @@
                 <m:d>
                   <m:dPr>
                     <m:begChr m:val="("/>
+                    <m:sepChr m:val=""/>
                     <m:endChr m:val=")"/>
-                    <m:sepChr m:val=""/>
                     <m:grow/>
                   </m:dPr>
                   <m:e>
@@ -8038,8 +8038,8 @@
         <m:d>
           <m:dPr>
             <m:begChr m:val="("/>
+            <m:sepChr m:val=""/>
             <m:endChr m:val=")"/>
-            <m:sepChr m:val=""/>
             <m:grow/>
           </m:dPr>
           <m:e>
@@ -8148,8 +8148,8 @@
           <m:d>
             <m:dPr>
               <m:begChr m:val="("/>
+              <m:sepChr m:val=""/>
               <m:endChr m:val=")"/>
-              <m:sepChr m:val=""/>
               <m:grow/>
             </m:dPr>
             <m:e>
@@ -8188,8 +8188,8 @@
           <m:d>
             <m:dPr>
               <m:begChr m:val="("/>
+              <m:sepChr m:val=""/>
               <m:endChr m:val=")"/>
-              <m:sepChr m:val=""/>
               <m:grow/>
             </m:dPr>
             <m:e>
@@ -8443,8 +8443,8 @@
           <m:d>
             <m:dPr>
               <m:begChr m:val="("/>
+              <m:sepChr m:val=""/>
               <m:endChr m:val=")"/>
-              <m:sepChr m:val=""/>
               <m:grow/>
             </m:dPr>
             <m:e>
@@ -8590,8 +8590,8 @@
           <m:d>
             <m:dPr>
               <m:begChr m:val="("/>
+              <m:sepChr m:val=""/>
               <m:endChr m:val=")"/>
-              <m:sepChr m:val=""/>
               <m:grow/>
             </m:dPr>
             <m:e>
@@ -8841,7 +8841,7 @@
         <w:t xml:space="preserve"> </w:t>
       </w:r>
       <w:r>
-        <w:t xml:space="preserve">(Botet, Kwok, and Cabane 2021)</w:t>
+        <w:t xml:space="preserve">(Botet, Kwok and Cabane, 2021)</w:t>
       </w:r>
       <w:r>
         <w:t xml:space="preserve">.</w:t>
@@ -9085,8 +9085,8 @@
               <m:d>
                 <m:dPr>
                   <m:begChr m:val="("/>
+                  <m:sepChr m:val=""/>
                   <m:endChr m:val=")"/>
-                  <m:sepChr m:val=""/>
                   <m:grow/>
                 </m:dPr>
                 <m:e>
@@ -9112,8 +9112,8 @@
           <m:d>
             <m:dPr>
               <m:begChr m:val="("/>
+              <m:sepChr m:val=""/>
               <m:endChr m:val=")"/>
-              <m:sepChr m:val=""/>
               <m:grow/>
             </m:dPr>
             <m:e>
@@ -9496,7 +9496,7 @@
         <w:t xml:space="preserve"> </w:t>
       </w:r>
       <w:r>
-        <w:t xml:space="preserve">The figure also shows one of the most useful aspects of the MDM method: predicting computational effort needed for extremely high resolution DEM models without generating them.</w:t>
+        <w:t xml:space="preserve">Figure also shows the MDM methods ability to predict the particles needed for extremely high resolution DEM models without generating them.</w:t>
       </w:r>
       <w:r>
         <w:t xml:space="preserve"> </w:t>
@@ -9545,7 +9545,7 @@
         <w:t xml:space="preserve"> </w:t>
       </w:r>
       <w:r>
-        <w:t xml:space="preserve">times the number of particles.</w:t>
+        <w:t xml:space="preserve">times the number of pa</w:t>
       </w:r>
     </w:p>
     <w:tbl>
@@ -9675,8 +9675,8 @@
         <m:d>
           <m:dPr>
             <m:begChr m:val="("/>
+            <m:sepChr m:val=""/>
             <m:endChr m:val=")"/>
-            <m:sepChr m:val=""/>
             <m:grow/>
           </m:dPr>
           <m:e>
@@ -9715,8 +9715,8 @@
         <m:d>
           <m:dPr>
             <m:begChr m:val="("/>
+            <m:sepChr m:val=""/>
             <m:endChr m:val=")"/>
-            <m:sepChr m:val=""/>
             <m:grow/>
           </m:dPr>
           <m:e>
@@ -10704,8 +10704,8 @@
         <m:d>
           <m:dPr>
             <m:begChr m:val="("/>
+            <m:sepChr m:val=""/>
             <m:endChr m:val=")"/>
-            <m:sepChr m:val=""/>
             <m:grow/>
           </m:dPr>
           <m:e>
@@ -10750,8 +10750,8 @@
         <m:d>
           <m:dPr>
             <m:begChr m:val="("/>
+            <m:sepChr m:val=""/>
             <m:endChr m:val=")"/>
-            <m:sepChr m:val=""/>
             <m:grow/>
           </m:dPr>
           <m:e>
@@ -10790,8 +10790,8 @@
         <m:d>
           <m:dPr>
             <m:begChr m:val="("/>
+            <m:sepChr m:val=""/>
             <m:endChr m:val=")"/>
-            <m:sepChr m:val=""/>
             <m:grow/>
           </m:dPr>
           <m:e>
@@ -11537,7 +11537,7 @@
         <w:t xml:space="preserve"> </w:t>
       </w:r>
       <w:r>
-        <w:t xml:space="preserve">(Ghalib and Hryciw 1999)</w:t>
+        <w:t xml:space="preserve">(Ghalib and Hryciw, 1999)</w:t>
       </w:r>
       <w:r>
         <w:t xml:space="preserve">.</w:t>
@@ -11731,7 +11731,7 @@
         <w:t xml:space="preserve"> </w:t>
       </w:r>
       <w:r>
-        <w:t xml:space="preserve">(Sufian et al. 2021)</w:t>
+        <w:t xml:space="preserve">(Sufian et al., 2021)</w:t>
       </w:r>
       <w:r>
         <w:t xml:space="preserve">.</w:t>
@@ -11855,13 +11855,7 @@
         <w:pStyle w:val="Bibliography"/>
       </w:pPr>
       <w:r>
-        <w:t xml:space="preserve">Bandera, Sara, Catherine O’Sullivan, Paul Tangney, and Stefano Angioletti-Uberti. 2021.</w:t>
-      </w:r>
-      <w:r>
-        <w:t xml:space="preserve"> </w:t>
-      </w:r>
-      <w:r>
-        <w:t xml:space="preserve">“Coarse-Grained Molecular Dynamics Simulations of Clay Compression.”</w:t>
+        <w:t xml:space="preserve">Bandera, S., O’Sullivan, C., Tangney, P. and Angioletti-Uberti, S., 2021. Coarse-grained molecular dynamics simulations of clay compression.</w:t>
       </w:r>
       <w:r>
         <w:t xml:space="preserve"> </w:t>
@@ -11874,20 +11868,14 @@
         <w:t xml:space="preserve">Computers and Geotechnics</w:t>
       </w:r>
       <w:r>
-        <w:t xml:space="preserve"> </w:t>
-      </w:r>
-      <w:r>
-        <w:t xml:space="preserve">138 (October): 104333.</w:t>
-      </w:r>
-      <w:r>
-        <w:t xml:space="preserve"> </w:t>
+        <w:t xml:space="preserve">, 138, p.104333. https://doi.org/</w:t>
       </w:r>
       <w:hyperlink r:id="rId84">
         <w:r>
           <w:rPr>
             <w:rStyle w:val="Hyperlink"/>
           </w:rPr>
-          <w:t xml:space="preserve">https://doi.org/10.1016/j.compgeo.2021.104333</w:t>
+          <w:t xml:space="preserve">10.1016/j.compgeo.2021.104333</w:t>
         </w:r>
       </w:hyperlink>
       <w:r>
@@ -11901,13 +11889,7 @@
         <w:pStyle w:val="Bibliography"/>
       </w:pPr>
       <w:r>
-        <w:t xml:space="preserve">Botet, Robert, Sylvie Kwok, and Bernard Cabane. 2021.</w:t>
-      </w:r>
-      <w:r>
-        <w:t xml:space="preserve"> </w:t>
-      </w:r>
-      <w:r>
-        <w:t xml:space="preserve">“Filling Space with Polydisperse Spheres in a Non-Apollonian Way.”</w:t>
+        <w:t xml:space="preserve">Botet, R., Kwok, S. and Cabane, B., 2021. Filling space with polydisperse spheres in a non-Apollonian way.</w:t>
       </w:r>
       <w:r>
         <w:t xml:space="preserve"> </w:t>
@@ -11920,20 +11902,14 @@
         <w:t xml:space="preserve">Journal of Physics A: Mathematical and Theoretical</w:t>
       </w:r>
       <w:r>
-        <w:t xml:space="preserve"> </w:t>
-      </w:r>
-      <w:r>
-        <w:t xml:space="preserve">54 (19): 195201.</w:t>
-      </w:r>
-      <w:r>
-        <w:t xml:space="preserve"> </w:t>
+        <w:t xml:space="preserve">, 54(19), p.195201. https://doi.org/</w:t>
       </w:r>
       <w:hyperlink r:id="rId86">
         <w:r>
           <w:rPr>
             <w:rStyle w:val="Hyperlink"/>
           </w:rPr>
-          <w:t xml:space="preserve">https://doi.org/10.1088/1751-8121/abef81</w:t>
+          <w:t xml:space="preserve">10.1088/1751-8121/abef81</w:t>
         </w:r>
       </w:hyperlink>
       <w:r>
@@ -11947,13 +11923,7 @@
         <w:pStyle w:val="Bibliography"/>
       </w:pPr>
       <w:r>
-        <w:t xml:space="preserve">Cantor, David, and Carlos Ovalle. 2025.</w:t>
-      </w:r>
-      <w:r>
-        <w:t xml:space="preserve"> </w:t>
-      </w:r>
-      <w:r>
-        <w:t xml:space="preserve">“Sample Size Effects on the Critical State Shear Strength of Granular Materials with Varied Gradation and the Role of Column-Like Local Structures.”</w:t>
+        <w:t xml:space="preserve">Cantor, D. and Ovalle, C., 2025. Sample size effects on the critical state shear strength of granular materials with varied gradation and the role of column-like local structures.</w:t>
       </w:r>
       <w:r>
         <w:t xml:space="preserve"> </w:t>
@@ -11966,20 +11936,14 @@
         <w:t xml:space="preserve">Géotechnique</w:t>
       </w:r>
       <w:r>
-        <w:t xml:space="preserve"> </w:t>
-      </w:r>
-      <w:r>
-        <w:t xml:space="preserve">75 (1): 29–40.</w:t>
-      </w:r>
-      <w:r>
-        <w:t xml:space="preserve"> </w:t>
+        <w:t xml:space="preserve">, 75(1), pp.29–40. https://doi.org/</w:t>
       </w:r>
       <w:hyperlink r:id="rId88">
         <w:r>
           <w:rPr>
             <w:rStyle w:val="Hyperlink"/>
           </w:rPr>
-          <w:t xml:space="preserve">https://doi.org/10.1680/jgeot.23.00032</w:t>
+          <w:t xml:space="preserve">10.1680/jgeot.23.00032</w:t>
         </w:r>
       </w:hyperlink>
       <w:r>
@@ -11993,13 +11957,7 @@
         <w:pStyle w:val="Bibliography"/>
       </w:pPr>
       <w:r>
-        <w:t xml:space="preserve">Cundall, P. A. 2001.</w:t>
-      </w:r>
-      <w:r>
-        <w:t xml:space="preserve"> </w:t>
-      </w:r>
-      <w:r>
-        <w:t xml:space="preserve">“A Discontinuous Future for Numerical Modelling in Geomechanics?”</w:t>
+        <w:t xml:space="preserve">Cundall, P.A., 2001. A discontinuous future for numerical modelling in geomechanics?</w:t>
       </w:r>
       <w:r>
         <w:t xml:space="preserve"> </w:t>
@@ -12012,20 +11970,14 @@
         <w:t xml:space="preserve">Proceedings of the Institution of Civil Engineers - Geotechnical Engineering</w:t>
       </w:r>
       <w:r>
-        <w:t xml:space="preserve"> </w:t>
-      </w:r>
-      <w:r>
-        <w:t xml:space="preserve">149 (1): 41–47.</w:t>
-      </w:r>
-      <w:r>
-        <w:t xml:space="preserve"> </w:t>
+        <w:t xml:space="preserve">, 149(1), pp.41–47. https://doi.org/</w:t>
       </w:r>
       <w:hyperlink r:id="rId90">
         <w:r>
           <w:rPr>
             <w:rStyle w:val="Hyperlink"/>
           </w:rPr>
-          <w:t xml:space="preserve">https://doi.org/10.1680/geng.2001.149.1.41</w:t>
+          <w:t xml:space="preserve">10.1680/geng.2001.149.1.41</w:t>
         </w:r>
       </w:hyperlink>
       <w:r>
@@ -12039,13 +11991,7 @@
         <w:pStyle w:val="Bibliography"/>
       </w:pPr>
       <w:r>
-        <w:t xml:space="preserve">Cundall, P. A., and O. D. L. Strack. 1979.</w:t>
-      </w:r>
-      <w:r>
-        <w:t xml:space="preserve"> </w:t>
-      </w:r>
-      <w:r>
-        <w:t xml:space="preserve">“A Discrete Numerical Model for Granular Assemblies.”</w:t>
+        <w:t xml:space="preserve">Cundall, P.A. and Strack, O.D.L., 1979. A discrete numerical model for granular assemblies.</w:t>
       </w:r>
       <w:r>
         <w:t xml:space="preserve"> </w:t>
@@ -12058,20 +12004,14 @@
         <w:t xml:space="preserve">Géotechnique</w:t>
       </w:r>
       <w:r>
-        <w:t xml:space="preserve"> </w:t>
-      </w:r>
-      <w:r>
-        <w:t xml:space="preserve">29 (1): 47–65.</w:t>
-      </w:r>
-      <w:r>
-        <w:t xml:space="preserve"> </w:t>
+        <w:t xml:space="preserve">, 29(1), pp.47–65. https://doi.org/</w:t>
       </w:r>
       <w:hyperlink r:id="rId92">
         <w:r>
           <w:rPr>
             <w:rStyle w:val="Hyperlink"/>
           </w:rPr>
-          <w:t xml:space="preserve">https://doi.org/10.1680/geot.1979.29.1.47</w:t>
+          <w:t xml:space="preserve">10.1680/geot.1979.29.1.47</w:t>
         </w:r>
       </w:hyperlink>
       <w:r>
@@ -12085,23 +12025,27 @@
         <w:pStyle w:val="Bibliography"/>
       </w:pPr>
       <w:r>
-        <w:t xml:space="preserve">D18 Committee. n.d.</w:t>
-      </w:r>
-      <w:r>
-        <w:t xml:space="preserve"> </w:t>
-      </w:r>
-      <w:r>
-        <w:t xml:space="preserve">“Test Methods for Particle-Size Distribution (Gradation) of Soils Using Sieve Analysis.”</w:t>
-      </w:r>
-      <w:r>
-        <w:t xml:space="preserve"> </w:t>
+        <w:t xml:space="preserve">D18 Committee, 2017.</w:t>
+      </w:r>
+      <w:r>
+        <w:t xml:space="preserve"> </w:t>
+      </w:r>
+      <w:r>
+        <w:rPr>
+          <w:i/>
+          <w:iCs/>
+        </w:rPr>
+        <w:t xml:space="preserve">Test methods for particle-size distribution (gradation) of soils using sieve analysis</w:t>
+      </w:r>
+      <w:r>
+        <w:t xml:space="preserve">. https://doi.org/</w:t>
       </w:r>
       <w:hyperlink r:id="rId94">
         <w:r>
           <w:rPr>
             <w:rStyle w:val="Hyperlink"/>
           </w:rPr>
-          <w:t xml:space="preserve">https://doi.org/10.1520/d6913_d6913m-17</w:t>
+          <w:t xml:space="preserve">10.1520/d6913_d6913m-17</w:t>
         </w:r>
       </w:hyperlink>
       <w:r>
@@ -12115,13 +12059,7 @@
         <w:pStyle w:val="Bibliography"/>
       </w:pPr>
       <w:r>
-        <w:t xml:space="preserve">Dong, Youkou, Dingtao Yan, and Lan Cui. 2022.</w:t>
-      </w:r>
-      <w:r>
-        <w:t xml:space="preserve"> </w:t>
-      </w:r>
-      <w:r>
-        <w:t xml:space="preserve">“An Efficient Parallel Framework for the Discrete Element Method Using GPU.”</w:t>
+        <w:t xml:space="preserve">Dong, Y., Yan, D. and Cui, L., 2022. An Efficient Parallel Framework for the Discrete Element Method Using GPU.</w:t>
       </w:r>
       <w:r>
         <w:t xml:space="preserve"> </w:t>
@@ -12134,20 +12072,14 @@
         <w:t xml:space="preserve">Applied Sciences</w:t>
       </w:r>
       <w:r>
-        <w:t xml:space="preserve"> </w:t>
-      </w:r>
-      <w:r>
-        <w:t xml:space="preserve">12 (6): 3107.</w:t>
-      </w:r>
-      <w:r>
-        <w:t xml:space="preserve"> </w:t>
+        <w:t xml:space="preserve">, 12(6), p.3107. https://doi.org/</w:t>
       </w:r>
       <w:hyperlink r:id="rId96">
         <w:r>
           <w:rPr>
             <w:rStyle w:val="Hyperlink"/>
           </w:rPr>
-          <w:t xml:space="preserve">https://doi.org/10.3390/app12063107</w:t>
+          <w:t xml:space="preserve">10.3390/app12063107</w:t>
         </w:r>
       </w:hyperlink>
       <w:r>
@@ -12161,13 +12093,7 @@
         <w:pStyle w:val="Bibliography"/>
       </w:pPr>
       <w:r>
-        <w:t xml:space="preserve">Erguler, Zeynal Abiddin. 2016.</w:t>
-      </w:r>
-      <w:r>
-        <w:t xml:space="preserve"> </w:t>
-      </w:r>
-      <w:r>
-        <w:t xml:space="preserve">“A Quantitative Method of Describing Grain Size Distribution of Soils and Some Examples for Its Applications.”</w:t>
+        <w:t xml:space="preserve">Erguler, Z.A., 2016. A quantitative method of describing grain size distribution of soils and some examples for its applications.</w:t>
       </w:r>
       <w:r>
         <w:t xml:space="preserve"> </w:t>
@@ -12180,20 +12106,14 @@
         <w:t xml:space="preserve">Bulletin of Engineering Geology and the Environment</w:t>
       </w:r>
       <w:r>
-        <w:t xml:space="preserve"> </w:t>
-      </w:r>
-      <w:r>
-        <w:t xml:space="preserve">75 (2): 807–19.</w:t>
-      </w:r>
-      <w:r>
-        <w:t xml:space="preserve"> </w:t>
+        <w:t xml:space="preserve">, 75(2), pp.807–819. https://doi.org/</w:t>
       </w:r>
       <w:hyperlink r:id="rId98">
         <w:r>
           <w:rPr>
             <w:rStyle w:val="Hyperlink"/>
           </w:rPr>
-          <w:t xml:space="preserve">https://doi.org/10.1007/s10064-015-0790-1</w:t>
+          <w:t xml:space="preserve">10.1007/s10064-015-0790-1</w:t>
         </w:r>
       </w:hyperlink>
       <w:r>
@@ -12207,13 +12127,7 @@
         <w:pStyle w:val="Bibliography"/>
       </w:pPr>
       <w:r>
-        <w:t xml:space="preserve">Fang, Luning, Ruochun Zhang, Colin Vanden Heuvel, Radu Serban, and Dan Negrut. 2021.</w:t>
-      </w:r>
-      <w:r>
-        <w:t xml:space="preserve"> </w:t>
-      </w:r>
-      <w:r>
-        <w:t xml:space="preserve">“Chrono::GPU: An Open-Source Simulation Package for Granular Dynamics Using the Discrete Element Method.”</w:t>
+        <w:t xml:space="preserve">Fang, L., Zhang, R., Vanden Heuvel, C., Serban, R. and Negrut, D., 2021. Chrono::GPU: An Open-Source Simulation Package for Granular Dynamics Using the Discrete Element Method.</w:t>
       </w:r>
       <w:r>
         <w:t xml:space="preserve"> </w:t>
@@ -12226,20 +12140,14 @@
         <w:t xml:space="preserve">Processes</w:t>
       </w:r>
       <w:r>
-        <w:t xml:space="preserve"> </w:t>
-      </w:r>
-      <w:r>
-        <w:t xml:space="preserve">9 (10): 1813.</w:t>
-      </w:r>
-      <w:r>
-        <w:t xml:space="preserve"> </w:t>
+        <w:t xml:space="preserve">, 9(10), p.1813. https://doi.org/</w:t>
       </w:r>
       <w:hyperlink r:id="rId100">
         <w:r>
           <w:rPr>
             <w:rStyle w:val="Hyperlink"/>
           </w:rPr>
-          <w:t xml:space="preserve">https://doi.org/10.3390/pr9101813</w:t>
+          <w:t xml:space="preserve">10.3390/pr9101813</w:t>
         </w:r>
       </w:hyperlink>
       <w:r>
@@ -12253,13 +12161,7 @@
         <w:pStyle w:val="Bibliography"/>
       </w:pPr>
       <w:r>
-        <w:t xml:space="preserve">Ghalib, Ali M., and Roman D. Hryciw. 1999.</w:t>
-      </w:r>
-      <w:r>
-        <w:t xml:space="preserve"> </w:t>
-      </w:r>
-      <w:r>
-        <w:t xml:space="preserve">“Soil Particle Size Distribution by Mosaic Imaging and Watershed Analysis.”</w:t>
+        <w:t xml:space="preserve">Ghalib, A.M. and Hryciw, R.D., 1999. Soil Particle Size Distribution by Mosaic Imaging and Watershed Analysis.</w:t>
       </w:r>
       <w:r>
         <w:t xml:space="preserve"> </w:t>
@@ -12272,20 +12174,14 @@
         <w:t xml:space="preserve">Journal of Computing in Civil Engineering</w:t>
       </w:r>
       <w:r>
-        <w:t xml:space="preserve"> </w:t>
-      </w:r>
-      <w:r>
-        <w:t xml:space="preserve">13 (2): 80–87.</w:t>
-      </w:r>
-      <w:r>
-        <w:t xml:space="preserve"> </w:t>
+        <w:t xml:space="preserve">, 13(2), pp.80–87. https://doi.org/</w:t>
       </w:r>
       <w:hyperlink r:id="rId102">
         <w:r>
           <w:rPr>
             <w:rStyle w:val="Hyperlink"/>
           </w:rPr>
-          <w:t xml:space="preserve">https://doi.org/10.1061/(ASCE)0887-3801(1999)13:2(80)</w:t>
+          <w:t xml:space="preserve">10.1061/(ASCE)0887-3801(1999)13:2(80)</w:t>
         </w:r>
       </w:hyperlink>
       <w:r>
@@ -12299,13 +12195,7 @@
         <w:pStyle w:val="Bibliography"/>
       </w:pPr>
       <w:r>
-        <w:t xml:space="preserve">Gitman, I. M., H. Askes, and L. J. Sluys. 2007.</w:t>
-      </w:r>
-      <w:r>
-        <w:t xml:space="preserve"> </w:t>
-      </w:r>
-      <w:r>
-        <w:t xml:space="preserve">“Representative Volume: Existence and Size Determination.”</w:t>
+        <w:t xml:space="preserve">Gitman, I.M., Askes, H. and Sluys, L.J., 2007. Representative volume: Existence and size determination.</w:t>
       </w:r>
       <w:r>
         <w:t xml:space="preserve"> </w:t>
@@ -12318,20 +12208,14 @@
         <w:t xml:space="preserve">Engineering Fracture Mechanics</w:t>
       </w:r>
       <w:r>
-        <w:t xml:space="preserve"> </w:t>
-      </w:r>
-      <w:r>
-        <w:t xml:space="preserve">74 (16): 2518–34.</w:t>
-      </w:r>
-      <w:r>
-        <w:t xml:space="preserve"> </w:t>
+        <w:t xml:space="preserve">, 74(16), pp.2518–2534. https://doi.org/</w:t>
       </w:r>
       <w:hyperlink r:id="rId104">
         <w:r>
           <w:rPr>
             <w:rStyle w:val="Hyperlink"/>
           </w:rPr>
-          <w:t xml:space="preserve">https://doi.org/10.1016/j.engfracmech.2006.12.021</w:t>
+          <w:t xml:space="preserve">10.1016/j.engfracmech.2006.12.021</w:t>
         </w:r>
       </w:hyperlink>
       <w:r>
@@ -12345,13 +12229,7 @@
         <w:pStyle w:val="Bibliography"/>
       </w:pPr>
       <w:r>
-        <w:t xml:space="preserve">Miyai, Shinichiro, Murino Kobayakawa, Takuya Tsuji, and Toshitsugu Tanaka. 2019.</w:t>
-      </w:r>
-      <w:r>
-        <w:t xml:space="preserve"> </w:t>
-      </w:r>
-      <w:r>
-        <w:t xml:space="preserve">“Influence of Particle Size on Vertical Plate Penetration into Dense Cohesionless Granular Materials (Large-Scale DEM Simulation Using Real Particle Size).”</w:t>
+        <w:t xml:space="preserve">Miyai, S., Kobayakawa, M., Tsuji, T. and Tanaka, T., 2019. Influence of particle size on vertical plate penetration into dense cohesionless granular materials (large-scale DEM simulation using real particle size).</w:t>
       </w:r>
       <w:r>
         <w:t xml:space="preserve"> </w:t>
@@ -12364,20 +12242,14 @@
         <w:t xml:space="preserve">Granular Matter</w:t>
       </w:r>
       <w:r>
-        <w:t xml:space="preserve"> </w:t>
-      </w:r>
-      <w:r>
-        <w:t xml:space="preserve">21 (4): 105.</w:t>
-      </w:r>
-      <w:r>
-        <w:t xml:space="preserve"> </w:t>
+        <w:t xml:space="preserve">, 21(4), p.105. https://doi.org/</w:t>
       </w:r>
       <w:hyperlink r:id="rId106">
         <w:r>
           <w:rPr>
             <w:rStyle w:val="Hyperlink"/>
           </w:rPr>
-          <w:t xml:space="preserve">https://doi.org/10.1007/s10035-019-0961-z</w:t>
+          <w:t xml:space="preserve">10.1007/s10035-019-0961-z</w:t>
         </w:r>
       </w:hyperlink>
       <w:r>
@@ -12391,29 +12263,14 @@
         <w:pStyle w:val="Bibliography"/>
       </w:pPr>
       <w:r>
-        <w:t xml:space="preserve">O’Sullivan, C. 2014.</w:t>
-      </w:r>
-      <w:r>
-        <w:t xml:space="preserve"> </w:t>
-      </w:r>
-      <w:r>
-        <w:t xml:space="preserve">“Advancing Geomechanics Using DEM.”</w:t>
-      </w:r>
-      <w:r>
-        <w:t xml:space="preserve"> </w:t>
-      </w:r>
-      <w:r>
-        <w:t xml:space="preserve">In, edited by Kenichi Soga, Krishna Kumar, Giovanna Biscontin, and Matthew Kuo, 21–32. CRC Press.</w:t>
-      </w:r>
-      <w:r>
-        <w:t xml:space="preserve"> </w:t>
+        <w:t xml:space="preserve">O’Sullivan, C., 2014. Advancing geomechanics using DEM. In: K. Soga, K. Kumar, G. Biscontin and M. Kuo, eds. CRC Press. pp.21–32. https://doi.org/</w:t>
       </w:r>
       <w:hyperlink r:id="rId108">
         <w:r>
           <w:rPr>
             <w:rStyle w:val="Hyperlink"/>
           </w:rPr>
-          <w:t xml:space="preserve">http://www.crcnetbase.com/doi/abs/10.1201/b17395-4</w:t>
+          <w:t xml:space="preserve">10.1201/b17395</w:t>
         </w:r>
       </w:hyperlink>
       <w:r>
@@ -12427,13 +12284,7 @@
         <w:pStyle w:val="Bibliography"/>
       </w:pPr>
       <w:r>
-        <w:t xml:space="preserve">Sufian, Adnan, Marion Artigaut, Thomas Shire, and Catherine O’Sullivan. 2021.</w:t>
-      </w:r>
-      <w:r>
-        <w:t xml:space="preserve"> </w:t>
-      </w:r>
-      <w:r>
-        <w:t xml:space="preserve">“Influence of Fabric on Stress Distribution in Gap-Graded Soil.”</w:t>
+        <w:t xml:space="preserve">Sufian, A., Artigaut, M., Shire, T. and O’Sullivan, C., 2021. Influence of Fabric on Stress Distribution in Gap-Graded Soil.</w:t>
       </w:r>
       <w:r>
         <w:t xml:space="preserve"> </w:t>
@@ -12446,20 +12297,14 @@
         <w:t xml:space="preserve">Journal of Geotechnical and Geoenvironmental Engineering</w:t>
       </w:r>
       <w:r>
-        <w:t xml:space="preserve"> </w:t>
-      </w:r>
-      <w:r>
-        <w:t xml:space="preserve">147 (5): 04021016.</w:t>
-      </w:r>
-      <w:r>
-        <w:t xml:space="preserve"> </w:t>
+        <w:t xml:space="preserve">, 147(5), p.04021016. https://doi.org/</w:t>
       </w:r>
       <w:hyperlink r:id="rId110">
         <w:r>
           <w:rPr>
             <w:rStyle w:val="Hyperlink"/>
           </w:rPr>
-          <w:t xml:space="preserve">https://doi.org/10.1061/(ASCE)GT.1943-5606.0002487</w:t>
+          <w:t xml:space="preserve">10.1061/(ASCE)GT.1943-5606.0002487</w:t>
         </w:r>
       </w:hyperlink>
       <w:r>
@@ -12473,13 +12318,7 @@
         <w:pStyle w:val="Bibliography"/>
       </w:pPr>
       <w:r>
-        <w:t xml:space="preserve">Tyler, Scott W., and Stephen W. Wheatcraft. 1992.</w:t>
-      </w:r>
-      <w:r>
-        <w:t xml:space="preserve"> </w:t>
-      </w:r>
-      <w:r>
-        <w:t xml:space="preserve">“Fractal Scaling of Soil Particle-Size Distributions: Analysis and Limitations.”</w:t>
+        <w:t xml:space="preserve">Tyler, S.W. and Wheatcraft, S.W., 1992. Fractal Scaling of Soil Particle-Size Distributions: Analysis and Limitations.</w:t>
       </w:r>
       <w:r>
         <w:t xml:space="preserve"> </w:t>
@@ -12492,20 +12331,14 @@
         <w:t xml:space="preserve">Soil Science Society of America Journal</w:t>
       </w:r>
       <w:r>
-        <w:t xml:space="preserve"> </w:t>
-      </w:r>
-      <w:r>
-        <w:t xml:space="preserve">56 (2): 362–69.</w:t>
-      </w:r>
-      <w:r>
-        <w:t xml:space="preserve"> </w:t>
+        <w:t xml:space="preserve">, 56(2), pp.362–369. https://doi.org/</w:t>
       </w:r>
       <w:hyperlink r:id="rId112">
         <w:r>
           <w:rPr>
             <w:rStyle w:val="Hyperlink"/>
           </w:rPr>
-          <w:t xml:space="preserve">https://doi.org/10.2136/sssaj1992.03615995005600020005x</w:t>
+          <w:t xml:space="preserve">10.2136/sssaj1992.03615995005600020005x</w:t>
         </w:r>
       </w:hyperlink>
       <w:r>
@@ -12519,13 +12352,7 @@
         <w:pStyle w:val="Bibliography"/>
       </w:pPr>
       <w:r>
-        <w:t xml:space="preserve">Zeraati-Shamsabadi, Mohammad, and Abouzar Sadrekarimi. 2025.</w:t>
-      </w:r>
-      <w:r>
-        <w:t xml:space="preserve"> </w:t>
-      </w:r>
-      <w:r>
-        <w:t xml:space="preserve">“A DEM Study on the Effects of Specimen and Particle Sizes on Direct Simple Shear Tests.”</w:t>
+        <w:t xml:space="preserve">Zeraati-Shamsabadi, M. and Sadrekarimi, A., 2025. A DEM study on the effects of specimen and particle sizes on direct simple shear tests.</w:t>
       </w:r>
       <w:r>
         <w:t xml:space="preserve"> </w:t>
@@ -12538,20 +12365,14 @@
         <w:t xml:space="preserve">Granular Matter</w:t>
       </w:r>
       <w:r>
-        <w:t xml:space="preserve"> </w:t>
-      </w:r>
-      <w:r>
-        <w:t xml:space="preserve">27 (2).</w:t>
-      </w:r>
-      <w:r>
-        <w:t xml:space="preserve"> </w:t>
+        <w:t xml:space="preserve">, 27(2). https://doi.org/</w:t>
       </w:r>
       <w:hyperlink r:id="rId114">
         <w:r>
           <w:rPr>
             <w:rStyle w:val="Hyperlink"/>
           </w:rPr>
-          <w:t xml:space="preserve">https://doi.org/10.1007/s10035-025-01513-y</w:t>
+          <w:t xml:space="preserve">10.1007/s10035-025-01513-y</w:t>
         </w:r>
       </w:hyperlink>
       <w:r>
@@ -12565,13 +12386,7 @@
         <w:pStyle w:val="Bibliography"/>
       </w:pPr>
       <w:r>
-        <w:t xml:space="preserve">Zhang, Ruochun, Bonaventura Tagliafierro, Colin Vanden Heuvel, Shlok Sabarwal, Luning Bakke, Yulong Yue, Xin Wei, Radu Serban, and Dan Negruţ. 2024.</w:t>
-      </w:r>
-      <w:r>
-        <w:t xml:space="preserve"> </w:t>
-      </w:r>
-      <w:r>
-        <w:t xml:space="preserve">“Chrono DEM-Engine: A Discrete Element Method Dual-GPU Simulator with Customizable Contact Forces and Element Shape.”</w:t>
+        <w:t xml:space="preserve">Zhang, R., Tagliafierro, B., Vanden Heuvel, C., Sabarwal, S., Bakke, L., Yue, Y., Wei, X., Serban, R. and Negruţ, D., 2024. Chrono DEM-engine: A discrete element method dual-GPU simulator with customizable contact forces and element shape.</w:t>
       </w:r>
       <w:r>
         <w:t xml:space="preserve"> </w:t>
@@ -12584,20 +12399,14 @@
         <w:t xml:space="preserve">Computer Physics Communications</w:t>
       </w:r>
       <w:r>
-        <w:t xml:space="preserve"> </w:t>
-      </w:r>
-      <w:r>
-        <w:t xml:space="preserve">300 (July): 109196.</w:t>
-      </w:r>
-      <w:r>
-        <w:t xml:space="preserve"> </w:t>
+        <w:t xml:space="preserve">, 300, p.109196. https://doi.org/</w:t>
       </w:r>
       <w:hyperlink r:id="rId116">
         <w:r>
           <w:rPr>
             <w:rStyle w:val="Hyperlink"/>
           </w:rPr>
-          <w:t xml:space="preserve">https://doi.org/10.1016/j.cpc.2024.109196</w:t>
+          <w:t xml:space="preserve">10.1016/j.cpc.2024.109196</w:t>
         </w:r>
       </w:hyperlink>
       <w:r>

</xml_diff>